<commit_message>
Complete Module 1 programming assignment
</commit_message>
<xml_diff>
--- a/module-1/Ddamulira GitHub Repository Setup.docx
+++ b/module-1/Ddamulira GitHub Repository Setup.docx
@@ -152,6 +152,20 @@
       </w:r>
     </w:p>
     <w:p>
+      <w:pPr>
+        <w:rPr>
+          <w:rFonts w:ascii="Arial" w:eastAsia="Times New Roman" w:hAnsi="Arial" w:cs="Arial"/>
+          <w:b/>
+          <w:bCs/>
+          <w:i/>
+          <w:iCs/>
+          <w:color w:val="000000"/>
+          <w:kern w:val="0"/>
+          <w:sz w:val="22"/>
+          <w:szCs w:val="22"/>
+          <w14:ligatures w14:val="none"/>
+        </w:rPr>
+      </w:pPr>
       <w:r>
         <w:rPr>
           <w:rFonts w:ascii="Arial" w:eastAsia="Times New Roman" w:hAnsi="Arial" w:cs="Arial"/>
@@ -166,6 +180,176 @@
           <w14:ligatures w14:val="none"/>
         </w:rPr>
         <w:t>CSD402-300H Java for Programmers (2271-DD)</w:t>
+      </w:r>
+    </w:p>
+    <w:p>
+      <w:pPr>
+        <w:rPr>
+          <w:rFonts w:ascii="Arial" w:eastAsia="Times New Roman" w:hAnsi="Arial" w:cs="Arial"/>
+          <w:b/>
+          <w:bCs/>
+          <w:i/>
+          <w:iCs/>
+          <w:color w:val="000000"/>
+          <w:kern w:val="0"/>
+          <w:sz w:val="22"/>
+          <w:szCs w:val="22"/>
+          <w14:ligatures w14:val="none"/>
+        </w:rPr>
+      </w:pPr>
+      <w:hyperlink r:id="rId5" w:history="1">
+        <w:r>
+          <w:rPr>
+            <w:rStyle w:val="Hyperlink"/>
+            <w:rFonts w:ascii="Arial" w:eastAsia="Times New Roman" w:hAnsi="Arial" w:cs="Arial"/>
+            <w:b/>
+            <w:bCs/>
+            <w:i/>
+            <w:iCs/>
+            <w:kern w:val="0"/>
+            <w:sz w:val="22"/>
+            <w:szCs w:val="22"/>
+            <w14:ligatures w14:val="none"/>
+          </w:rPr>
+          <w:t>https://github.com/psddam/csd-402.git</w:t>
+        </w:r>
+      </w:hyperlink>
+    </w:p>
+    <w:p>
+      <w:pPr>
+        <w:rPr>
+          <w:rFonts w:ascii="Arial" w:eastAsia="Times New Roman" w:hAnsi="Arial" w:cs="Arial"/>
+          <w:b/>
+          <w:bCs/>
+          <w:i/>
+          <w:iCs/>
+          <w:color w:val="000000"/>
+          <w:kern w:val="0"/>
+          <w:sz w:val="22"/>
+          <w:szCs w:val="22"/>
+          <w14:ligatures w14:val="none"/>
+        </w:rPr>
+      </w:pPr>
+    </w:p>
+    <w:p>
+      <w:pPr>
+        <w:rPr>
+          <w:rFonts w:ascii="Arial" w:eastAsia="Times New Roman" w:hAnsi="Arial" w:cs="Arial"/>
+          <w:b/>
+          <w:bCs/>
+          <w:i/>
+          <w:iCs/>
+          <w:color w:val="000000"/>
+          <w:kern w:val="0"/>
+          <w:sz w:val="22"/>
+          <w:szCs w:val="22"/>
+          <w14:ligatures w14:val="none"/>
+        </w:rPr>
+      </w:pPr>
+      <w:r>
+        <w:rPr>
+          <w:rFonts w:ascii="Arial" w:eastAsia="Times New Roman" w:hAnsi="Arial" w:cs="Arial"/>
+          <w:b/>
+          <w:bCs/>
+          <w:i/>
+          <w:iCs/>
+          <w:color w:val="000000"/>
+          <w:kern w:val="0"/>
+          <w:sz w:val="22"/>
+          <w:szCs w:val="22"/>
+          <w14:ligatures w14:val="none"/>
+        </w:rPr>
+        <w:drawing>
+          <wp:inline distT="0" distB="0" distL="0" distR="0" wp14:anchorId="15DB95C2" wp14:editId="6ABA82C8">
+            <wp:extent cx="5943600" cy="5775960"/>
+            <wp:effectExtent l="0" t="0" r="0" b="0"/>
+            <wp:docPr id="1234888630" name="Picture 1"/>
+            <wp:cNvGraphicFramePr>
+              <a:graphicFrameLocks xmlns:a="http://schemas.openxmlformats.org/drawingml/2006/main" noChangeAspect="1"/>
+            </wp:cNvGraphicFramePr>
+            <a:graphic xmlns:a="http://schemas.openxmlformats.org/drawingml/2006/main">
+              <a:graphicData uri="http://schemas.openxmlformats.org/drawingml/2006/picture">
+                <pic:pic xmlns:pic="http://schemas.openxmlformats.org/drawingml/2006/picture">
+                  <pic:nvPicPr>
+                    <pic:cNvPr id="1234888630" name=""/>
+                    <pic:cNvPicPr/>
+                  </pic:nvPicPr>
+                  <pic:blipFill>
+                    <a:blip r:embed="rId6"/>
+                    <a:stretch>
+                      <a:fillRect/>
+                    </a:stretch>
+                  </pic:blipFill>
+                  <pic:spPr>
+                    <a:xfrm>
+                      <a:off x="0" y="0"/>
+                      <a:ext cx="5943600" cy="5775960"/>
+                    </a:xfrm>
+                    <a:prstGeom prst="rect">
+                      <a:avLst/>
+                    </a:prstGeom>
+                  </pic:spPr>
+                </pic:pic>
+              </a:graphicData>
+            </a:graphic>
+          </wp:inline>
+        </w:drawing>
+      </w:r>
+    </w:p>
+    <w:p>
+      <w:pPr>
+        <w:rPr>
+          <w:rFonts w:ascii="Arial" w:eastAsia="Times New Roman" w:hAnsi="Arial" w:cs="Arial"/>
+          <w:b/>
+          <w:bCs/>
+          <w:i/>
+          <w:iCs/>
+          <w:color w:val="000000"/>
+          <w:kern w:val="0"/>
+          <w:sz w:val="22"/>
+          <w:szCs w:val="22"/>
+          <w14:ligatures w14:val="none"/>
+        </w:rPr>
+      </w:pPr>
+    </w:p>
+    <w:p>
+      <w:r>
+        <w:lastRenderedPageBreak/>
+        <w:drawing>
+          <wp:inline distT="0" distB="0" distL="0" distR="0" wp14:anchorId="5753C552" wp14:editId="34B50C81">
+            <wp:extent cx="5943600" cy="3060700"/>
+            <wp:effectExtent l="0" t="0" r="0" b="6350"/>
+            <wp:docPr id="1971870710" name="Picture 1"/>
+            <wp:cNvGraphicFramePr>
+              <a:graphicFrameLocks xmlns:a="http://schemas.openxmlformats.org/drawingml/2006/main" noChangeAspect="1"/>
+            </wp:cNvGraphicFramePr>
+            <a:graphic xmlns:a="http://schemas.openxmlformats.org/drawingml/2006/main">
+              <a:graphicData uri="http://schemas.openxmlformats.org/drawingml/2006/picture">
+                <pic:pic xmlns:pic="http://schemas.openxmlformats.org/drawingml/2006/picture">
+                  <pic:nvPicPr>
+                    <pic:cNvPr id="1971870710" name=""/>
+                    <pic:cNvPicPr/>
+                  </pic:nvPicPr>
+                  <pic:blipFill>
+                    <a:blip r:embed="rId7"/>
+                    <a:stretch>
+                      <a:fillRect/>
+                    </a:stretch>
+                  </pic:blipFill>
+                  <pic:spPr>
+                    <a:xfrm>
+                      <a:off x="0" y="0"/>
+                      <a:ext cx="5943600" cy="3060700"/>
+                    </a:xfrm>
+                    <a:prstGeom prst="rect">
+                      <a:avLst/>
+                    </a:prstGeom>
+                  </pic:spPr>
+                </pic:pic>
+              </a:graphicData>
+            </a:graphic>
+          </wp:inline>
+        </w:drawing>
       </w:r>
     </w:p>
     <w:sectPr>
@@ -905,6 +1089,7 @@
   <w:style w:type="character" w:default="1" w:styleId="DefaultParagraphFont">
     <w:name w:val="Default Paragraph Font"/>
     <w:uiPriority w:val="1"/>
+    <w:semiHidden/>
     <w:unhideWhenUsed/>
   </w:style>
   <w:style w:type="table" w:default="1" w:styleId="TableNormal">

</xml_diff>